<commit_message>
rebuild site, freeze and benchmark results from scratch
Co-Authored-By: Claude Sonnet 5.5 <noreply@anthropic.com>
</commit_message>
<xml_diff>
--- a/docs/posts/nepal-population-density/index.docx
+++ b/docs/posts/nepal-population-density/index.docx
@@ -4727,7 +4727,7 @@
         <w:rPr>
           <w:rStyle w:val="VerbatimChar"/>
         </w:rPr>
-        <w:t xml:space="preserve">Rendering started: 2026-10-23 15:50:21.306365 </w:t>
+        <w:t xml:space="preserve">Rendering started: 2026-10-23 21:19:52.771416 </w:t>
       </w:r>
     </w:p>
     <w:p>
@@ -4738,7 +4738,7 @@
         <w:rPr>
           <w:rStyle w:val="VerbatimChar"/>
         </w:rPr>
-        <w:t xml:space="preserve">Rendering completed in: 11.2010162830353 </w:t>
+        <w:t xml:space="preserve">Rendering completed in: 11.1370483001073 </w:t>
       </w:r>
     </w:p>
     <w:bookmarkEnd w:id="31"/>

</xml_diff>

<commit_message>
rebuild site and freeze from scratch on a clean machine
Co-Authored-By: Claude Sonnet 5.5 <noreply@anthropic.com>
</commit_message>
<xml_diff>
--- a/docs/posts/nepal-population-density/index.docx
+++ b/docs/posts/nepal-population-density/index.docx
@@ -4727,7 +4727,7 @@
         <w:rPr>
           <w:rStyle w:val="VerbatimChar"/>
         </w:rPr>
-        <w:t xml:space="preserve">Rendering started: 2026-10-23 21:19:52.771416 </w:t>
+        <w:t xml:space="preserve">Rendering started: 2026-10-23 23:12:18.121659 </w:t>
       </w:r>
     </w:p>
     <w:p>
@@ -4738,7 +4738,7 @@
         <w:rPr>
           <w:rStyle w:val="VerbatimChar"/>
         </w:rPr>
-        <w:t xml:space="preserve">Rendering completed in: 11.1370483001073 </w:t>
+        <w:t xml:space="preserve">Rendering completed in: 1.81201066573461 </w:t>
       </w:r>
     </w:p>
     <w:bookmarkEnd w:id="31"/>

</xml_diff>